<commit_message>
Rewrite IRB #1 Appendix F recruitment emails in IRB #3 style
Warmer tone, UMaine employee gift-card exclusion stated in each email,
"2 business days" instead of "48 hours", contact names at end. Added
F.4 compensation-sending email. Comparison-population texts renumbered
to F.5/F.6.

Co-Authored-By: Claude Opus 4.6 <noreply@anthropic.com>
Claude-Session: https://claude.ai/code/session_015tocUfoT1qtE8rjyvLrk9a
</commit_message>
<xml_diff>
--- a/irb1-reflection-groups/CURRENT/IRB1_Protocol_v6.docx
+++ b/irb1-reflection-groups/CURRENT/IRB1_Protocol_v6.docx
@@ -1187,7 +1187,7 @@
         <w:spacing w:before="0" w:after="80" w:line="259" w:lineRule="auto"/>
       </w:pPr>
       <w:r>
-        <w:t xml:space="preserve">Comparison-group professionals will be recruited through the research team's newsletters, email invitations to alumni networks, and social media announcements. No professional recruiting company or agency is used. The evaluation plan anticipates that later-year comparative studies will involve intervention populations of roughly 60–100 participants and comparison groups of roughly 200 professionals. A modification will be submitted for control group recruitment details at a later date to the IRB for review and approval prior to any recruitment for this group beginning; the recruitment texts will be submitted with it, and are reserved as Appendices F.4 and F.5.</w:t>
+        <w:t xml:space="preserve">Comparison-group professionals will be recruited through the research team's newsletters, email invitations to alumni networks, and social media announcements. No professional recruiting company or agency is used. The evaluation plan anticipates that later-year comparative studies will involve intervention populations of roughly 60–100 participants and comparison groups of roughly 200 professionals. A modification will be submitted for control group recruitment details at a later date to the IRB for review and approval prior to any recruitment for this group beginning; the recruitment texts will be submitted with it, and are reserved as Appendices F.5 and F.6.</w:t>
       </w:r>
     </w:p>
     <w:p>
@@ -4663,7 +4663,7 @@
         <w:rPr>
           <w:i/>
         </w:rPr>
-        <w:t xml:space="preserve">Greetings, I am [name], [role] in the Department of Computer Science at the University of Maine ([email]). I am writing about the research study on reflection that runs alongside the reflection groups, led by Dr. Gregory L. Nelson (gregory.nelson@maine.edu). Here is the link to a confidential follow-up survey: &lt;insert link&gt;. It takes about 10–15 minutes and asks about your learning, professional skills, and reflection practices. The first page is the consent form, and submitting the survey indicates your consent. Taking part is voluntary and you may skip any question. For each follow-up survey you submit, you will receive a $10 electronic VISA gift card within 48 hours; to send it we will ask you for a few details on a short separate form that is never linked to your answers. Questions are welcome — just reply to this message. Thank you again for your time and contribution,</w:t>
+        <w:t xml:space="preserve">Greetings, I hope this message finds you well. I am reaching out regarding the University of Maine research study on reflection that runs alongside the reflection groups. Here is the link to a confidential online follow-up survey about your learning, professional skills, and reflection practices, which takes about 10–15 minutes: ____. The first page is the consent form, and submitting the survey indicates your consent. Taking part is voluntary and you may skip any question. For this survey, you will receive a $10 electronic VISA gift card within 2 business days of submission — one gift card per survey invitation (University policy does not permit gift cards for University of Maine employees, who take part without compensation). If you have any questions, contact Greg Nelson, Assistant Professor, University of Maine (gregory.nelson@maine.edu) or Cyril Agbewali-Koku, PhD Student (cyril.agbewalikoku@maine.edu). Thank you again for your time and contribution,</w:t>
       </w:r>
     </w:p>
     <w:p>
@@ -4723,7 +4723,7 @@
         <w:rPr>
           <w:i/>
         </w:rPr>
-        <w:t xml:space="preserve">Greetings, I am [name], [role] in the Department of Computer Science at the University of Maine ([email]). I am writing to invite you to a confidential interview for our research study on reflection, led by Dr. Gregory L. Nelson (gregory.nelson@maine.edu). The interview is one-to-one, takes about 30–60 minutes, and is held on Zoom or in person, whichever you prefer. It is audio-recorded so that it can be transcribed; no video is recorded, and if you would rather not be recorded I will take written notes instead and you can still take part. We would ask about your experience of the reflection activities, your professional skills, and what has changed for you over time. For each interview you complete you will receive a $25 electronic VISA gift card within 48 hours; to send it we will ask you for a few details on a short separate form that is never linked to your answers. The consent form is attached, and I will go through it with you before we begin. Here is a scheduling link if you would like to take part: &lt;insert link&gt;. Taking part is voluntary. Questions? Reply to this message. Thank you,</w:t>
+        <w:t xml:space="preserve">Greetings, we are inviting you to take part in a research interview about your experience of the reflection activities, your professional-skill behaviors, and what has changed for you over time, as part of a University of Maine research study. The interview is one-to-one, takes about 30–60 minutes, and is held on Zoom or in person, based on your preference. With your agreement the interview is audio-recorded (no video is recorded); if you would rather not be recorded, the researcher will take written notes instead. If you would like to participate, here is a scheduling link: ____. Before the interview you will see our consent form. If you take part in an interview, you will receive a $25 electronic VISA gift card within 2 business days (University policy does not permit gift cards for University of Maine employees, who take part without compensation). If you have any questions, contact Greg Nelson, Assistant Professor, University of Maine (gregory.nelson@maine.edu) or Cyril Agbewali-Koku, PhD Student (cyril.agbewalikoku@maine.edu). Thank you,</w:t>
       </w:r>
     </w:p>
     <w:p>
@@ -4743,7 +4743,47 @@
           <w:b/>
           <w:sz w:val="24"/>
         </w:rPr>
-        <w:t xml:space="preserve">F.4 and F.5 — comparison population, surveys and interviews</w:t>
+        <w:t xml:space="preserve">F.4 Sending compensation</w:t>
+      </w:r>
+    </w:p>
+    <w:p>
+      <w:pPr>
+        <w:spacing w:before="0" w:after="60" w:line="259" w:lineRule="auto"/>
+      </w:pPr>
+      <w:r>
+        <w:t/>
+      </w:r>
+    </w:p>
+    <w:p>
+      <w:pPr>
+        <w:spacing w:before="0" w:after="80" w:line="259" w:lineRule="auto"/>
+        <w:ind w:left="360" w:hanging="0"/>
+      </w:pPr>
+      <w:r>
+        <w:rPr>
+          <w:i/>
+        </w:rPr>
+        <w:t xml:space="preserve">Greetings, thank you for completing the (survey / interview) for the reflection research project. Here is your $__ electronic VISA gift card: ____. We appreciate your time and your contribution.</w:t>
+      </w:r>
+    </w:p>
+    <w:p>
+      <w:pPr>
+        <w:spacing w:before="0" w:after="60" w:line="259" w:lineRule="auto"/>
+      </w:pPr>
+      <w:r>
+        <w:t/>
+      </w:r>
+    </w:p>
+    <w:p>
+      <w:pPr>
+        <w:spacing w:before="180" w:after="70" w:line="259" w:lineRule="auto"/>
+      </w:pPr>
+      <w:r>
+        <w:rPr>
+          <w:b/>
+          <w:sz w:val="24"/>
+        </w:rPr>
+        <w:t xml:space="preserve">F.5 and F.6 — comparison population, surveys and interviews</w:t>
       </w:r>
     </w:p>
     <w:p>

</xml_diff>

<commit_message>
IRB1 v6: change compensation from direct gift cards to raffle entries
Applies the PI's decision to switch from direct compensation to raffle
draws for surveys ($10) and interviews ($25). Updated consistently across
§9, consent forms (Appendices B and D), recruitment emails (F.2, F.3),
compensation-sending email (F.4), and the compensation information form
(Appendix G). Also fixes "comparisons group" → "comparison groups" typo
in §4.

Co-Authored-By: Claude Opus 4.6 <noreply@anthropic.com>
Claude-Session: https://claude.ai/code/session_015tocUfoT1QtE8rjyvLrk9a
</commit_message>
<xml_diff>
--- a/irb1-reflection-groups/CURRENT/IRB1_Protocol_v6.docx
+++ b/irb1-reflection-groups/CURRENT/IRB1_Protocol_v6.docx
@@ -1027,7 +1027,7 @@
         <w:spacing w:before="0" w:after="80" w:line="259" w:lineRule="auto"/>
       </w:pPr>
       <w:r>
-        <w:t xml:space="preserve">Reflection groups are normally formed in sizes of 3–5 members (typically 5). Given we will openly recruit people online to be a part of the study, over 5 years we may have up to 1,000 participants, including participants who participate in various reflection activities or in comparisons group who do some or none of the reflection activities.</w:t>
+        <w:t xml:space="preserve">Reflection groups are normally formed in sizes of 3–5 members (typically 5). Given we will openly recruit people online to be a part of the study, over 5 years we may have up to 1,000 participants, including participants who participate in various reflection activities or in comparison groups who do some or none of the reflection activities.</w:t>
       </w:r>
     </w:p>
     <w:p>
@@ -1123,7 +1123,7 @@
         <w:spacing w:before="0" w:after="80" w:line="259" w:lineRule="auto"/>
       </w:pPr>
       <w:r>
-        <w:t xml:space="preserve">Members are invited by the email in Appendix F.2, sent at each survey point. It states that this is research in its opening lines, names a researcher and gives contact information, gives the length of the survey and the compensation offered, and links to the survey, whose first page is the consent form in Appendix B.</w:t>
+        <w:t xml:space="preserve">Members are invited by the email in Appendix F.2, sent at each survey point. It states that this is research in its opening lines, names a researcher and gives contact information, gives the length of the survey and the raffle entry offered, and links to the survey, whose first page is the consent form in Appendix B.</w:t>
       </w:r>
     </w:p>
     <w:p>
@@ -1155,7 +1155,7 @@
         <w:spacing w:before="0" w:after="80" w:line="259" w:lineRule="auto"/>
       </w:pPr>
       <w:r>
-        <w:t xml:space="preserve">Members are invited by the email in Appendix F.3, at the points described in Section 2. It states that this is research in its opening lines, names a researcher and gives contact information, states the length and format of the interview, states that the interview is audio-recorded and that a member who prefers not to be recorded may take part with written notes instead, states the compensation offered, and carries a scheduling link. The interview consent form (Appendix D) is sent with the invitation.</w:t>
+        <w:t xml:space="preserve">Members are invited by the email in Appendix F.3, at the points described in Section 2. It states that this is research in its opening lines, names a researcher and gives contact information, states the length and format of the interview, states that the interview is audio-recorded and that a member who prefers not to be recorded may take part with written notes instead, states the raffle entry offered, and carries a scheduling link. The interview consent form (Appendix D) is sent with the invitation.</w:t>
       </w:r>
     </w:p>
     <w:p>
@@ -1719,39 +1719,39 @@
         <w:spacing w:before="0" w:after="80" w:line="259" w:lineRule="auto"/>
       </w:pPr>
       <w:r>
-        <w:t xml:space="preserve">For each longitudinal follow-up survey a participant submits (Appendix C), the participant will be offered a $10 electronic VISA gift card, sent by email within 48 hours of survey submission. Participants must reach the end of the survey to receive compensation, though they may skip individual questions. A participant who submits all nine follow-up surveys over four years would receive $90 in total.</w:t>
-      </w:r>
-    </w:p>
-    <w:p>
-      <w:pPr>
-        <w:spacing w:before="0" w:after="60" w:line="259" w:lineRule="auto"/>
-      </w:pPr>
-      <w:r>
-        <w:t/>
-      </w:r>
-    </w:p>
-    <w:p>
-      <w:pPr>
-        <w:spacing w:before="0" w:after="80" w:line="259" w:lineRule="auto"/>
-      </w:pPr>
-      <w:r>
-        <w:t xml:space="preserve">Participants who complete an interview will be offered a $25 electronic VISA gift card, sent by email within 48 hours of the interview. Compensation is offered per interview: a participant who takes part in an interview after one participation cycle and another after the next cycle would receive $50 in total.</w:t>
-      </w:r>
-    </w:p>
-    <w:p>
-      <w:pPr>
-        <w:spacing w:before="0" w:after="60" w:line="259" w:lineRule="auto"/>
-      </w:pPr>
-      <w:r>
-        <w:t/>
-      </w:r>
-    </w:p>
-    <w:p>
-      <w:pPr>
-        <w:spacing w:before="0" w:after="80" w:line="259" w:lineRule="auto"/>
-      </w:pPr>
-      <w:r>
-        <w:t xml:space="preserve">Comparison-group participants are offered the same compensation as members: a $10 electronic VISA gift card for each follow-up survey submitted, and a $25 electronic VISA gift card for each interview completed.</w:t>
+        <w:t xml:space="preserve">For each longitudinal follow-up survey a participant submits (Appendix C), the participant will be entered into a raffle to win a $10 electronic VISA gift card, sent by email within 48 hours of the raffle draw. Participants must reach the end of the survey to be entered into the raffle, though they may skip individual questions.</w:t>
+      </w:r>
+    </w:p>
+    <w:p>
+      <w:pPr>
+        <w:spacing w:before="0" w:after="60" w:line="259" w:lineRule="auto"/>
+      </w:pPr>
+      <w:r>
+        <w:t/>
+      </w:r>
+    </w:p>
+    <w:p>
+      <w:pPr>
+        <w:spacing w:before="0" w:after="80" w:line="259" w:lineRule="auto"/>
+      </w:pPr>
+      <w:r>
+        <w:t xml:space="preserve">Participants who complete an interview will be entered into a raffle to win a $25 electronic VISA gift card, sent by email within 48 hours of the raffle draw. Entry is per interview.</w:t>
+      </w:r>
+    </w:p>
+    <w:p>
+      <w:pPr>
+        <w:spacing w:before="0" w:after="60" w:line="259" w:lineRule="auto"/>
+      </w:pPr>
+      <w:r>
+        <w:t/>
+      </w:r>
+    </w:p>
+    <w:p>
+      <w:pPr>
+        <w:spacing w:before="0" w:after="80" w:line="259" w:lineRule="auto"/>
+      </w:pPr>
+      <w:r>
+        <w:t xml:space="preserve">Comparison-group participants are offered the same raffle entries as members: entry into a raffle to win a $10 electronic VISA gift card for each follow-up survey submitted, and entry into a raffle to win a $25 electronic VISA gift card for each interview completed.</w:t>
       </w:r>
     </w:p>
     <w:p>
@@ -1799,7 +1799,7 @@
         <w:spacing w:before="0" w:after="80" w:line="259" w:lineRule="auto"/>
       </w:pPr>
       <w:r>
-        <w:t xml:space="preserve">Gift cards are sent as each survey is submitted and as each interview is completed. The final gift cards under this protocol will be distributed no later than December 2035, which is the end of the four-year follow-up window for the last participation cycle this protocol anticipates.</w:t>
+        <w:t xml:space="preserve">Gift cards are sent within 48 hours of each raffle draw. The final gift cards under this protocol will be distributed no later than December 2035, which is the end of the four-year follow-up window for the last participation cycle this protocol anticipates.</w:t>
       </w:r>
     </w:p>
     <w:p>
@@ -2663,7 +2663,7 @@
         <w:spacing w:before="0" w:after="80" w:line="259" w:lineRule="auto"/>
       </w:pPr>
       <w:r>
-        <w:t xml:space="preserve">For each longitudinal follow-up survey you submit, you will be compensated with a $10 electronic VISA gift card, sent by email within 48 hours of submission. You must reach the end of the survey to receive this compensation, though you may skip the occasional question. One gift card is offered per survey invitation. For example, if you submit four follow-up surveys over two years, that would be $40 in total; if you submit all nine over four years, that would be $90 in total.</w:t>
+        <w:t xml:space="preserve">For each longitudinal follow-up survey you submit, you will be entered into a raffle to win a $10 electronic VISA gift card. You must reach the end of the survey to be entered, though you may skip the occasional question. After the raffle draw, the winner will receive the gift card by email within 48 hours.</w:t>
       </w:r>
     </w:p>
     <w:p>
@@ -4077,7 +4077,7 @@
         <w:spacing w:before="0" w:after="80" w:line="259" w:lineRule="auto"/>
       </w:pPr>
       <w:r>
-        <w:t xml:space="preserve">For each interview, you will be compensated with a $25 electronic VISA gift card. You must reach the end of the interview in order to receive this compensation, though you may skip the occasional question. You will receive your compensation by email within 48 hours of the interview. For example, if you take part in an interview after one participation cycle and then another after the next cycle, that would be two interviews and $50 in total.</w:t>
+        <w:t xml:space="preserve">For each interview, you will be entered into a raffle to win a $25 electronic VISA gift card. You must reach the end of the interview to be entered, though you may skip the occasional question. After the raffle draw, the winner will receive the gift card by email within 48 hours. For example, if you take part in an interview after one participation cycle and then another after the next cycle, that would be two separate raffle entries.</w:t>
       </w:r>
     </w:p>
     <w:p>
@@ -4663,7 +4663,7 @@
         <w:rPr>
           <w:i/>
         </w:rPr>
-        <w:t xml:space="preserve">Greetings, I hope this message finds you well. I am reaching out regarding the University of Maine research study on reflection that runs alongside the reflection groups. Here is the link to a confidential online follow-up survey about your learning, professional skills, and reflection practices, which takes about 10–15 minutes: ____. The first page is the consent form, and submitting the survey indicates your consent. Taking part is voluntary and you may skip any question. For this survey, you will receive a $10 electronic VISA gift card within 2 business days of submission — one gift card per survey invitation (University policy does not permit gift cards for University of Maine employees, who take part without compensation). If you have any questions, contact Greg Nelson, Assistant Professor, University of Maine (gregory.nelson@maine.edu) or Cyril Agbewali-Koku, PhD Student (cyril.agbewalikoku@maine.edu). Thank you again for your time and contribution,</w:t>
+        <w:t xml:space="preserve">Greetings, I hope this message finds you well. I am reaching out regarding the University of Maine research study on reflection that runs alongside the reflection groups. Here is the link to a confidential online follow-up survey about your learning, professional skills, and reflection practices, which takes about 10–15 minutes: ____. The first page is the consent form, and submitting the survey indicates your consent. Taking part is voluntary and you may skip any question. For this survey, you will be entered into a raffle to win a $10 electronic VISA gift card — if you win, the gift card will be sent within 2 business days of the draw (University policy does not permit gift cards for University of Maine employees, who take part without compensation). If you have any questions, contact Greg Nelson, Assistant Professor, University of Maine (gregory.nelson@maine.edu) or Cyril Agbewali-Koku, PhD Student (cyril.agbewalikoku@maine.edu). Thank you again for your time and contribution,</w:t>
       </w:r>
     </w:p>
     <w:p>
@@ -4723,7 +4723,7 @@
         <w:rPr>
           <w:i/>
         </w:rPr>
-        <w:t xml:space="preserve">Greetings, we are inviting you to take part in a research interview about your experience of the reflection activities, your professional-skill behaviors, and what has changed for you over time, as part of a University of Maine research study. The interview is one-to-one, takes about 30–60 minutes, and is held on Zoom or in person, based on your preference. With your agreement the interview is audio-recorded (no video is recorded); if you would rather not be recorded, the researcher will take written notes instead. If you would like to participate, here is a scheduling link: ____. Before the interview you will see our consent form. If you take part in an interview, you will receive a $25 electronic VISA gift card within 2 business days (University policy does not permit gift cards for University of Maine employees, who take part without compensation). If you have any questions, contact Greg Nelson, Assistant Professor, University of Maine (gregory.nelson@maine.edu) or Cyril Agbewali-Koku, PhD Student (cyril.agbewalikoku@maine.edu). Thank you,</w:t>
+        <w:t xml:space="preserve">Greetings, we are inviting you to take part in a research interview about your experience of the reflection activities, your professional-skill behaviors, and what has changed for you over time, as part of a University of Maine research study. The interview is one-to-one, takes about 30–60 minutes, and is held on Zoom or in person, based on your preference. With your agreement the interview is audio-recorded (no video is recorded); if you would rather not be recorded, the researcher will take written notes instead. If you would like to participate, here is a scheduling link: ____. Before the interview you will see our consent form. If you take part in an interview, you will be entered into a raffle to win a $25 electronic VISA gift card — if you win, the gift card will be sent within 2 business days of the draw (University policy does not permit gift cards for University of Maine employees, who take part without compensation). If you have any questions, contact Greg Nelson, Assistant Professor, University of Maine (gregory.nelson@maine.edu) or Cyril Agbewali-Koku, PhD Student (cyril.agbewalikoku@maine.edu). Thank you,</w:t>
       </w:r>
     </w:p>
     <w:p>
@@ -4763,7 +4763,7 @@
         <w:rPr>
           <w:i/>
         </w:rPr>
-        <w:t xml:space="preserve">Greetings, thank you for completing the (survey / interview) for the reflection research project. Here is your $__ electronic VISA gift card: ____. We appreciate your time and your contribution.</w:t>
+        <w:t xml:space="preserve">Greetings, congratulations — you have won the raffle draw for the (survey / interview) you completed for the reflection research project. Here is your $__ electronic VISA gift card: ____. We appreciate your time and your contribution.</w:t>
       </w:r>
     </w:p>
     <w:p>
@@ -4835,23 +4835,23 @@
         <w:spacing w:before="0" w:after="80" w:line="259" w:lineRule="auto"/>
       </w:pPr>
       <w:r>
-        <w:t xml:space="preserve">Administered through Qualtrics as a standalone form, separately from every research instrument, to participants who have earned a gift card and wish to receive one. It is linked from the confirmation message at the end of a compensated survey and sent by email after an interview. Responses are stored apart from research data and are never joined to a participant's survey responses, interview, or written reflections.</w:t>
-      </w:r>
-    </w:p>
-    <w:p>
-      <w:pPr>
-        <w:spacing w:before="0" w:after="60" w:line="259" w:lineRule="auto"/>
-      </w:pPr>
-      <w:r>
-        <w:t/>
-      </w:r>
-    </w:p>
-    <w:p>
-      <w:pPr>
-        <w:spacing w:before="0" w:after="80" w:line="259" w:lineRule="auto"/>
-      </w:pPr>
-      <w:r>
-        <w:t xml:space="preserve">Introduction: You have completed an activity for which we offer compensation. To issue and record the payment, the University requires some information from you. This form is separate from the study. What you enter here is not connected to your answers, and no one analyzing the research data sees it. Completing this form is optional: if you would rather not, you remain in the research on exactly the same terms and we simply cannot send you a gift card.</w:t>
+        <w:t xml:space="preserve">Administered through Qualtrics as a standalone form, separately from every research instrument, to participants who have won a raffle draw and wish to receive a gift card. It is linked from the notification email sent to raffle winners. Responses are stored apart from research data and are never joined to a participant's survey responses, interview, or written reflections.</w:t>
+      </w:r>
+    </w:p>
+    <w:p>
+      <w:pPr>
+        <w:spacing w:before="0" w:after="60" w:line="259" w:lineRule="auto"/>
+      </w:pPr>
+      <w:r>
+        <w:t/>
+      </w:r>
+    </w:p>
+    <w:p>
+      <w:pPr>
+        <w:spacing w:before="0" w:after="80" w:line="259" w:lineRule="auto"/>
+      </w:pPr>
+      <w:r>
+        <w:t xml:space="preserve">Introduction: You have won a raffle draw for an activity you completed in this research project. To issue and record the payment, the University requires some information from you. This form is separate from the study. What you enter here is not connected to your answers, and no one analyzing the research data sees it. Completing this form is optional: if you would rather not, you remain in the research on exactly the same terms and we simply cannot send you a gift card.</w:t>
       </w:r>
     </w:p>
     <w:p>
@@ -4947,7 +4947,7 @@
         <w:spacing w:before="0" w:after="80" w:line="259" w:lineRule="auto"/>
       </w:pPr>
       <w:r>
-        <w:t xml:space="preserve">5. Confirmation of receipt: I acknowledge that I will receive an electronic gift card of the value stated in the consent form for this activity. (Checkbox)</w:t>
+        <w:t xml:space="preserve">5. Confirmation of receipt: I acknowledge that I will receive an electronic gift card of the value stated in the raffle notification for this activity. (Checkbox)</w:t>
       </w:r>
     </w:p>
     <w:p>

</xml_diff>

<commit_message>
IRB1 v6: rewrite Appendix A per PI edits
Replaces the narrow opt-out form with the PI's expanded version that
covers all research activities (surveys, interviews, reflection materials).
Grammar corrected: removed duplicate paragraphs, fixed punctuation,
cleaned raffle language.

Co-Authored-By: Claude Opus 4.6 <noreply@anthropic.com>
Claude-Session: https://claude.ai/code/session_015tocUfoT1QtE8rjyvLrk9a
</commit_message>
<xml_diff>
--- a/irb1-reflection-groups/CURRENT/IRB1_Protocol_v6.docx
+++ b/irb1-reflection-groups/CURRENT/IRB1_Protocol_v6.docx
@@ -1934,7 +1934,7 @@
         <w:spacing w:before="0" w:after="80" w:line="259" w:lineRule="auto"/>
       </w:pPr>
       <w:r>
-        <w:t xml:space="preserve">You are invited to be part of a research project being conducted by Dr. Gregory L. Nelson, a faculty member in the Department of Computer Science at the University of Maine. The reflection group you have joined is a service we offer, and it is not research. This form is about something separate: whether the materials your group's activities produce may also be used as research data. The purpose of the research is to study how reflecting — on your own and together with others in small groups — affects learning, professional skills, self-efficacy, professional identity, and improvement over time. You must be at least 18 years of age to be part of the research.</w:t>
+        <w:t xml:space="preserve">You are invited to participate in a research project led by Dr. Gregory L. Nelson, a faculty member in the Department of Computer Science at the University of Maine. The purpose of the research is to study how reflecting — on your own and together with others in small groups — affects learning, professional skills, self-efficacy, professional identity, and improvement over time. You must be at least 18 years of age to be part of the research.</w:t>
       </w:r>
     </w:p>
     <w:p>
@@ -1970,7 +1970,7 @@
         <w:spacing w:before="0" w:after="80" w:line="259" w:lineRule="auto"/>
       </w:pPr>
       <w:r>
-        <w:t xml:space="preserve">You are not asked to do anything extra, and this asks no additional time of you beyond the reflection group itself. Everything listed here is something you do in the group anyway. If you are willing for it to be used as research data, you do not need to do anything at all. What we would use:</w:t>
+        <w:t xml:space="preserve">If you decide to participate in the research, you may be asked to:</w:t>
       </w:r>
     </w:p>
     <w:p>
@@ -1987,7 +1987,7 @@
         <w:ind w:left="720" w:hanging="360"/>
       </w:pPr>
       <w:r>
-        <w:t xml:space="preserve">•	The intake survey you filled out when you joined, including your availability, background, prior programming experience, and demographic answers;</w:t>
+        <w:t xml:space="preserve">•	Complete a confidential survey when you begin, and provide your availability and a small amount of background information so you can be matched into a small reflection group (normally 3–5 people);</w:t>
       </w:r>
     </w:p>
     <w:p>
@@ -1996,7 +1996,7 @@
         <w:ind w:left="720" w:hanging="360"/>
       </w:pPr>
       <w:r>
-        <w:t xml:space="preserve">•	Your icebreaker answers;</w:t>
+        <w:t xml:space="preserve">•	Participate in regular (for example, weekly) online reflection group meetings of about 30 minutes during a participation cycle of approximately 12 weeks (your group may continue meeting after the cycle ends if it wishes);</w:t>
       </w:r>
     </w:p>
     <w:p>
@@ -2005,7 +2005,7 @@
         <w:ind w:left="720" w:hanging="360"/>
       </w:pPr>
       <w:r>
-        <w:t xml:space="preserve">•	Your group's meeting agenda notes, including the notes from the longer retrospective meeting at the end of a cycle;</w:t>
+        <w:t xml:space="preserve">•	After each group session, complete a brief individual reflection survey, about 5–10 minutes;</w:t>
       </w:r>
     </w:p>
     <w:p>
@@ -2014,7 +2014,7 @@
         <w:ind w:left="720" w:hanging="360"/>
       </w:pPr>
       <w:r>
-        <w:t xml:space="preserve">•	The brief individual reflection you write after each meeting;</w:t>
+        <w:t xml:space="preserve">•	Complete confidential follow-up surveys of about 10–15 minutes each at approximately 3 months, 6 months, and then about every 6 months, for up to four years (up to 9 follow-up surveys total);</w:t>
       </w:r>
     </w:p>
     <w:p>
@@ -2023,7 +2023,7 @@
         <w:ind w:left="720" w:hanging="360"/>
       </w:pPr>
       <w:r>
-        <w:t xml:space="preserve">•	Notes and materials from the whole-cohort activity and from any session where members suggest improvements to the reflection groups;</w:t>
+        <w:t xml:space="preserve">•	Optionally participate in intermittent broader activities with other research participants in other groups (held online). For example, halfway through the research participation cycle, an activity to discuss trends, challenges, and successful strategies, and to provide feedback on how to improve the reflection groups;</w:t>
       </w:r>
     </w:p>
     <w:p>
@@ -2032,23 +2032,16 @@
         <w:ind w:left="720" w:hanging="360"/>
       </w:pPr>
       <w:r>
-        <w:t xml:space="preserve">•	How you use the online tool that supports your group, such as your responses to its reminders.</w:t>
-      </w:r>
-    </w:p>
-    <w:p>
-      <w:pPr>
-        <w:spacing w:before="0" w:after="60" w:line="259" w:lineRule="auto"/>
-      </w:pPr>
-      <w:r>
-        <w:t/>
-      </w:r>
-    </w:p>
-    <w:p>
-      <w:pPr>
-        <w:spacing w:before="0" w:after="80" w:line="259" w:lineRule="auto"/>
-      </w:pPr>
-      <w:r>
-        <w:t xml:space="preserve">Your group meetings are not recorded. No audio and no video is captured, and no researcher sits in on your meetings.</w:t>
+        <w:t xml:space="preserve">•	Have your reflection group materials, individual reflections, and use of the supporting tool analyzed by the research team;</w:t>
+      </w:r>
+    </w:p>
+    <w:p>
+      <w:pPr>
+        <w:spacing w:before="0" w:after="80" w:line="259" w:lineRule="auto"/>
+        <w:ind w:left="720" w:hanging="360"/>
+      </w:pPr>
+      <w:r>
+        <w:t xml:space="preserve">•	Optionally take part in a confidential interview about your experiences.</w:t>
       </w:r>
     </w:p>
     <w:p>
@@ -2244,7 +2237,7 @@
         <w:spacing w:before="0" w:after="80" w:line="259" w:lineRule="auto"/>
       </w:pPr>
       <w:r>
-        <w:t xml:space="preserve">There is no compensation for the research use of your reflection group materials.</w:t>
+        <w:t xml:space="preserve">For each longitudinal follow-up survey you submit, you will be entered into a raffle to win a $10 electronic VISA gift card. You must reach the end of the survey to be entered, though you may skip the occasional question. After the raffle draw, the winner will receive the gift card by email within 48 hours. If you opt to take part in an interview, you will be entered into a raffle to win a $25 electronic VISA gift card, sent by email within 48 hours of the raffle draw. There is no compensation for other activities.</w:t>
       </w:r>
     </w:p>
     <w:p>
@@ -3181,12 +3174,12 @@
         <w:drawing>
           <wp:inline xmlns:wp="http://schemas.openxmlformats.org/drawingml/2006/wordprocessingDrawing" distT="0" distB="0" distL="0" distR="0">
             <wp:extent cx="5943600" cy="5097283"/>
-            <wp:docPr id="377" name="Picture 377"/>
+            <wp:docPr id="376" name="Picture 376"/>
             <a:graphic xmlns:a="http://schemas.openxmlformats.org/drawingml/2006/main">
               <a:graphicData uri="http://schemas.openxmlformats.org/drawingml/2006/picture">
                 <pic:pic xmlns:pic="http://schemas.openxmlformats.org/drawingml/2006/picture">
                   <pic:nvPicPr>
-                    <pic:cNvPr id="377" name="Picture 377"/>
+                    <pic:cNvPr id="376" name="Picture 376"/>
                     <pic:cNvPicPr/>
                   </pic:nvPicPr>
                   <pic:blipFill>
@@ -3228,12 +3221,12 @@
         <w:drawing>
           <wp:inline xmlns:wp="http://schemas.openxmlformats.org/drawingml/2006/wordprocessingDrawing" distT="0" distB="0" distL="0" distR="0">
             <wp:extent cx="5943600" cy="4719533"/>
-            <wp:docPr id="379" name="Picture 379"/>
+            <wp:docPr id="378" name="Picture 378"/>
             <a:graphic xmlns:a="http://schemas.openxmlformats.org/drawingml/2006/main">
               <a:graphicData uri="http://schemas.openxmlformats.org/drawingml/2006/picture">
                 <pic:pic xmlns:pic="http://schemas.openxmlformats.org/drawingml/2006/picture">
                   <pic:nvPicPr>
-                    <pic:cNvPr id="379" name="Picture 379"/>
+                    <pic:cNvPr id="378" name="Picture 378"/>
                     <pic:cNvPicPr/>
                   </pic:nvPicPr>
                   <pic:blipFill>
@@ -3310,12 +3303,12 @@
         <w:drawing>
           <wp:inline xmlns:wp="http://schemas.openxmlformats.org/drawingml/2006/wordprocessingDrawing" distT="0" distB="0" distL="0" distR="0">
             <wp:extent cx="5943600" cy="7275145"/>
-            <wp:docPr id="385" name="Picture 385"/>
+            <wp:docPr id="384" name="Picture 384"/>
             <a:graphic xmlns:a="http://schemas.openxmlformats.org/drawingml/2006/main">
               <a:graphicData uri="http://schemas.openxmlformats.org/drawingml/2006/picture">
                 <pic:pic xmlns:pic="http://schemas.openxmlformats.org/drawingml/2006/picture">
                   <pic:nvPicPr>
-                    <pic:cNvPr id="385" name="Picture 385"/>
+                    <pic:cNvPr id="384" name="Picture 384"/>
                     <pic:cNvPicPr/>
                   </pic:nvPicPr>
                   <pic:blipFill>
@@ -3459,12 +3452,12 @@
         <w:drawing>
           <wp:inline xmlns:wp="http://schemas.openxmlformats.org/drawingml/2006/wordprocessingDrawing" distT="0" distB="0" distL="0" distR="0">
             <wp:extent cx="5943600" cy="4731937"/>
-            <wp:docPr id="399" name="Picture 399"/>
+            <wp:docPr id="398" name="Picture 398"/>
             <a:graphic xmlns:a="http://schemas.openxmlformats.org/drawingml/2006/main">
               <a:graphicData uri="http://schemas.openxmlformats.org/drawingml/2006/picture">
                 <pic:pic xmlns:pic="http://schemas.openxmlformats.org/drawingml/2006/picture">
                   <pic:nvPicPr>
-                    <pic:cNvPr id="399" name="Picture 399"/>
+                    <pic:cNvPr id="398" name="Picture 398"/>
                     <pic:cNvPicPr/>
                   </pic:nvPicPr>
                   <pic:blipFill>
@@ -3506,12 +3499,12 @@
         <w:drawing>
           <wp:inline xmlns:wp="http://schemas.openxmlformats.org/drawingml/2006/wordprocessingDrawing" distT="0" distB="0" distL="0" distR="0">
             <wp:extent cx="5791200" cy="7172325"/>
-            <wp:docPr id="401" name="Picture 401"/>
+            <wp:docPr id="400" name="Picture 400"/>
             <a:graphic xmlns:a="http://schemas.openxmlformats.org/drawingml/2006/main">
               <a:graphicData uri="http://schemas.openxmlformats.org/drawingml/2006/picture">
                 <pic:pic xmlns:pic="http://schemas.openxmlformats.org/drawingml/2006/picture">
                   <pic:nvPicPr>
-                    <pic:cNvPr id="401" name="Picture 401"/>
+                    <pic:cNvPr id="400" name="Picture 400"/>
                     <pic:cNvPicPr/>
                   </pic:nvPicPr>
                   <pic:blipFill>

</xml_diff>